<commit_message>
feat: version 9.0.0 for v15.0.8
</commit_message>
<xml_diff>
--- a/Using ChatGPT for VarAC translations.docx
+++ b/Using ChatGPT for VarAC translations.docx
@@ -47,6 +47,11 @@
         <w:br/>
         <w:t>But first See the video to fully understand how it works.</w:t>
       </w:r>
+    </w:p>
+    <w:p>
+      <w:r>
+        <w:t>When working with the prompt – for best performance, provide 50-100 lines at any time and not all files together.</w:t>
+      </w:r>
       <w:r>
         <w:br/>
       </w:r>
@@ -212,6 +217,7 @@
         <w:br/>
       </w:r>
       <w:r>
+        <w:lastRenderedPageBreak/>
         <w:br/>
         <w:t>Words you must leave in English:</w:t>
       </w:r>
@@ -220,9 +226,6 @@
       </w:r>
       <w:r>
         <w:br/>
-      </w:r>
-      <w:r>
-        <w:lastRenderedPageBreak/>
         <w:t>Clipboard</w:t>
       </w:r>
       <w:r>
@@ -239,8 +242,12 @@
       </w:r>
       <w:r>
         <w:br/>
+      </w:r>
+      <w:proofErr w:type="spellStart"/>
+      <w:r>
         <w:t>EmComm</w:t>
       </w:r>
+      <w:proofErr w:type="spellEnd"/>
       <w:r>
         <w:br/>
       </w:r>
@@ -890,6 +897,7 @@
   <w:style w:type="character" w:default="1" w:styleId="DefaultParagraphFont">
     <w:name w:val="Default Paragraph Font"/>
     <w:uiPriority w:val="1"/>
+    <w:semiHidden/>
     <w:unhideWhenUsed/>
   </w:style>
   <w:style w:type="table" w:default="1" w:styleId="TableNormal">

</xml_diff>